<commit_message>
Remove tier labels (Extra Support/Above) from differentiation sheets
Kept the red/blue color coding so it still reads clearly for the teacher, but stripped the text labels naming which tier each box is for - students shouldn't be able to read that off a handout.
</commit_message>
<xml_diff>
--- a/resources/week-01/W1L1 - About Me & Goals Reflection - Differentiation Support.docx
+++ b/resources/week-01/W1L1 - About Me & Goals Reflection - Differentiation Support.docx
@@ -103,21 +103,6 @@
           <w:szCs w:val="22"/>
         </w:rPr>
         <w:t xml:space="preserve">______________</w:t>
-      </w:r>
-    </w:p>
-    <w:p>
-      <w:pPr>
-        <w:spacing w:after="80"/>
-      </w:pPr>
-      <w:r>
-        <w:rPr>
-          <w:rFonts w:ascii="Times New Roman" w:cs="Times New Roman" w:eastAsia="Times New Roman" w:hAnsi="Times New Roman"/>
-          <w:b w:val="false"/>
-          <w:bCs w:val="false"/>
-          <w:sz w:val="22"/>
-          <w:szCs w:val="22"/>
-        </w:rPr>
-        <w:t xml:space="preserve">Give the box below to students who need extra support with today's task.</w:t>
       </w:r>
     </w:p>
     <w:tbl>
@@ -146,22 +131,6 @@
               <w:right w:type="dxa" w:w="160"/>
             </w:tcMar>
           </w:tcPr>
-          <w:p>
-            <w:pPr>
-              <w:spacing w:after="80"/>
-            </w:pPr>
-            <w:r>
-              <w:rPr>
-                <w:rFonts w:ascii="Times New Roman" w:cs="Times New Roman" w:eastAsia="Times New Roman" w:hAnsi="Times New Roman"/>
-                <w:b/>
-                <w:bCs/>
-                <w:color w:val="EE0000"/>
-                <w:sz w:val="22"/>
-                <w:szCs w:val="22"/>
-              </w:rPr>
-              <w:t xml:space="preserve">Extra Support (Beginning)</w:t>
-            </w:r>
-          </w:p>
           <w:p>
             <w:pPr>
               <w:spacing w:after="60"/>
@@ -209,21 +178,6 @@
         <w:spacing w:after="300"/>
       </w:pPr>
     </w:p>
-    <w:p>
-      <w:pPr>
-        <w:spacing w:after="80"/>
-      </w:pPr>
-      <w:r>
-        <w:rPr>
-          <w:rFonts w:ascii="Times New Roman" w:cs="Times New Roman" w:eastAsia="Times New Roman" w:hAnsi="Times New Roman"/>
-          <w:b w:val="false"/>
-          <w:bCs w:val="false"/>
-          <w:sz w:val="22"/>
-          <w:szCs w:val="22"/>
-        </w:rPr>
-        <w:t xml:space="preserve">Give the box below to students who finish early or are ready for a challenge.</w:t>
-      </w:r>
-    </w:p>
     <w:tbl>
       <w:tblPr>
         <w:tblW w:type="pct" w:w="100%"/>
@@ -250,22 +204,6 @@
               <w:right w:type="dxa" w:w="160"/>
             </w:tcMar>
           </w:tcPr>
-          <w:p>
-            <w:pPr>
-              <w:spacing w:after="80"/>
-            </w:pPr>
-            <w:r>
-              <w:rPr>
-                <w:rFonts w:ascii="Times New Roman" w:cs="Times New Roman" w:eastAsia="Times New Roman" w:hAnsi="Times New Roman"/>
-                <w:b/>
-                <w:bCs/>
-                <w:color w:val="0070C0"/>
-                <w:sz w:val="22"/>
-                <w:szCs w:val="22"/>
-              </w:rPr>
-              <w:t xml:space="preserve">Extension (Above)</w:t>
-            </w:r>
-          </w:p>
           <w:p>
             <w:pPr>
               <w:spacing w:after="60"/>

</xml_diff>